<commit_message>
Update CoRL oral and spotlight distinctions and resume
</commit_message>
<xml_diff>
--- a/files/Resume.docx
+++ b/files/Resume.docx
@@ -1283,7 +1283,27 @@
           <w:sz w:val="21"/>
           <w:szCs w:val="21"/>
         </w:rPr>
-        <w:t>Strengthened record-scoped authorization and concurrent-write reliability by deriving access decisions from persisted records and implementing idempotent label writes with explicit transaction handling, constraint translation, and post-transaction reads</w:t>
+        <w:t xml:space="preserve">Strengthened record-scoped authorization and concurrent-write reliability by deriving </w:t>
+      </w:r>
+      <w:proofErr w:type="gramStart"/>
+      <w:r>
+        <w:rPr>
+          <w:rFonts w:ascii="Calibri" w:eastAsia="Times New Roman" w:hAnsi="Calibri" w:cs="Calibri"/>
+          <w:color w:val="000000"/>
+          <w:sz w:val="21"/>
+          <w:szCs w:val="21"/>
+        </w:rPr>
+        <w:t>access</w:t>
+      </w:r>
+      <w:proofErr w:type="gramEnd"/>
+      <w:r>
+        <w:rPr>
+          <w:rFonts w:ascii="Calibri" w:eastAsia="Times New Roman" w:hAnsi="Calibri" w:cs="Calibri"/>
+          <w:color w:val="000000"/>
+          <w:sz w:val="21"/>
+          <w:szCs w:val="21"/>
+        </w:rPr>
+        <w:t xml:space="preserve"> decisions from persisted records and implementing idempotent label writes with explicit transaction handling, constraint translation, and post-transaction reads</w:t>
       </w:r>
     </w:p>
     <w:p>
@@ -1309,7 +1329,27 @@
           <w:sz w:val="21"/>
           <w:szCs w:val="21"/>
         </w:rPr>
-        <w:t>Built keyset-batched bulk labeling for up to 500 risks per request with item-level outcomes and delivered an AWS Cloudscape governance UI with filtering, grouping, drill-downs, and change history; reduced grouped-report API calls from 10 to 1 and data-fetch latency by approximately 80%; and implemented formula-safe CSV/Excel exports</w:t>
+        <w:t xml:space="preserve">Built keyset-batched bulk labeling for up to 500 risks per request with item-level outcomes and delivered an AWS Cloudscape governance UI with filtering, grouping, </w:t>
+      </w:r>
+      <w:proofErr w:type="gramStart"/>
+      <w:r>
+        <w:rPr>
+          <w:rFonts w:ascii="Calibri" w:eastAsia="Times New Roman" w:hAnsi="Calibri" w:cs="Calibri"/>
+          <w:color w:val="000000"/>
+          <w:sz w:val="21"/>
+          <w:szCs w:val="21"/>
+        </w:rPr>
+        <w:t>drill-downs</w:t>
+      </w:r>
+      <w:proofErr w:type="gramEnd"/>
+      <w:r>
+        <w:rPr>
+          <w:rFonts w:ascii="Calibri" w:eastAsia="Times New Roman" w:hAnsi="Calibri" w:cs="Calibri"/>
+          <w:color w:val="000000"/>
+          <w:sz w:val="21"/>
+          <w:szCs w:val="21"/>
+        </w:rPr>
+        <w:t>, and change history; reduced grouped-report API calls from 10 to 1 and data-fetch latency by approximately 80%; and implemented formula-safe CSV/Excel exports</w:t>
       </w:r>
     </w:p>
     <w:p>
@@ -2242,7 +2282,52 @@
           <w:sz w:val="21"/>
           <w:szCs w:val="21"/>
         </w:rPr>
-        <w:t xml:space="preserve">, “MolmoB0T: Large-Scale Simulation Enables Zero-Shot Manipulation,” Conference on Robot Learning (CoRL), 2026. Best </w:t>
+        <w:t>, “MolmoB0T: Large-Scale Simulation Enables Zero-Shot Manipulation,” CoRL 2026</w:t>
+      </w:r>
+      <w:r>
+        <w:rPr>
+          <w:rFonts w:ascii="Calibri" w:eastAsia="Times New Roman" w:hAnsi="Calibri" w:cs="Calibri" w:hint="eastAsia"/>
+          <w:color w:val="000000"/>
+          <w:sz w:val="21"/>
+          <w:szCs w:val="21"/>
+        </w:rPr>
+        <w:t xml:space="preserve"> </w:t>
+      </w:r>
+      <w:r>
+        <w:rPr>
+          <w:rFonts w:ascii="Calibri" w:eastAsia="Times New Roman" w:hAnsi="Calibri" w:cs="Calibri" w:hint="eastAsia"/>
+          <w:color w:val="000000"/>
+          <w:sz w:val="21"/>
+          <w:szCs w:val="21"/>
+        </w:rPr>
+        <w:t>(</w:t>
+      </w:r>
+      <w:r>
+        <w:rPr>
+          <w:rFonts w:ascii="Calibri" w:eastAsia="Times New Roman" w:hAnsi="Calibri" w:cs="Calibri"/>
+          <w:color w:val="000000"/>
+          <w:sz w:val="21"/>
+          <w:szCs w:val="21"/>
+        </w:rPr>
+        <w:t>Oral</w:t>
+      </w:r>
+      <w:r>
+        <w:rPr>
+          <w:rFonts w:ascii="Calibri" w:hAnsi="Calibri" w:cs="Calibri" w:hint="eastAsia"/>
+          <w:color w:val="000000"/>
+          <w:sz w:val="21"/>
+          <w:szCs w:val="21"/>
+        </w:rPr>
+        <w:t>)</w:t>
+      </w:r>
+      <w:r>
+        <w:rPr>
+          <w:rFonts w:ascii="Calibri" w:eastAsia="Times New Roman" w:hAnsi="Calibri" w:cs="Calibri"/>
+          <w:color w:val="000000"/>
+          <w:sz w:val="21"/>
+          <w:szCs w:val="21"/>
+        </w:rPr>
+        <w:t xml:space="preserve">. Best </w:t>
       </w:r>
       <w:r>
         <w:rPr>
@@ -2404,7 +2489,70 @@
           <w:sz w:val="21"/>
           <w:szCs w:val="21"/>
         </w:rPr>
-        <w:t>Conference on Robot Learning (CoRL), 2026.</w:t>
+        <w:t>CoRL</w:t>
+      </w:r>
+      <w:r>
+        <w:rPr>
+          <w:rFonts w:ascii="Calibri" w:hAnsi="Calibri" w:cs="Calibri" w:hint="eastAsia"/>
+          <w:color w:val="000000"/>
+          <w:sz w:val="21"/>
+          <w:szCs w:val="21"/>
+        </w:rPr>
+        <w:t xml:space="preserve"> </w:t>
+      </w:r>
+      <w:r>
+        <w:rPr>
+          <w:rFonts w:ascii="Calibri" w:hAnsi="Calibri" w:cs="Calibri"/>
+          <w:color w:val="000000"/>
+          <w:sz w:val="21"/>
+          <w:szCs w:val="21"/>
+        </w:rPr>
+        <w:t>2026</w:t>
+      </w:r>
+      <w:r>
+        <w:rPr>
+          <w:rFonts w:ascii="Calibri" w:hAnsi="Calibri" w:cs="Calibri" w:hint="eastAsia"/>
+          <w:color w:val="000000"/>
+          <w:sz w:val="21"/>
+          <w:szCs w:val="21"/>
+        </w:rPr>
+        <w:t xml:space="preserve"> </w:t>
+      </w:r>
+      <w:r>
+        <w:rPr>
+          <w:rFonts w:ascii="Calibri" w:hAnsi="Calibri" w:cs="Calibri" w:hint="eastAsia"/>
+          <w:color w:val="000000"/>
+          <w:sz w:val="21"/>
+          <w:szCs w:val="21"/>
+        </w:rPr>
+        <w:t>(</w:t>
+      </w:r>
+      <w:r>
+        <w:rPr>
+          <w:rFonts w:ascii="Calibri" w:hAnsi="Calibri" w:cs="Calibri" w:hint="eastAsia"/>
+          <w:color w:val="000000"/>
+          <w:sz w:val="21"/>
+          <w:szCs w:val="21"/>
+        </w:rPr>
+        <w:t>Spotlight</w:t>
+      </w:r>
+      <w:r>
+        <w:rPr>
+          <w:rFonts w:ascii="Calibri" w:hAnsi="Calibri" w:cs="Calibri" w:hint="eastAsia"/>
+          <w:color w:val="000000"/>
+          <w:sz w:val="21"/>
+          <w:szCs w:val="21"/>
+        </w:rPr>
+        <w:t>)</w:t>
+      </w:r>
+      <w:r>
+        <w:rPr>
+          <w:rFonts w:ascii="Calibri" w:hAnsi="Calibri" w:cs="Calibri"/>
+          <w:color w:val="000000"/>
+          <w:sz w:val="21"/>
+          <w:szCs w:val="21"/>
+        </w:rPr>
+        <w:t>.</w:t>
       </w:r>
       <w:r>
         <w:rPr>

</xml_diff>